<commit_message>
v2.0: Working 1-click interactive demo with Flask backend and live telemetry
</commit_message>
<xml_diff>
--- a/report_new_structure 17 sept.docx
+++ b/report_new_structure 17 sept.docx
@@ -9,19 +9,18 @@
         <w:ind w:right="413" w:firstLine="0"/>
         <w:jc w:val="center"/>
         <w:rPr>
-          <w:sz w:val="36"/>
-          <w:szCs w:val="36"/>
-        </w:rPr>
-      </w:pPr>
-      <w:bookmarkStart w:id="0" w:name="_Toc230562501"/>
-      <w:r>
-        <w:rPr>
-          <w:sz w:val="36"/>
-          <w:szCs w:val="36"/>
-        </w:rPr>
-        <w:t>Autonomous Self-Healing Infrastructure for Containerized Applications via Ensemble Confidence Scoring</w:t>
-      </w:r>
-      <w:bookmarkEnd w:id="0"/>
+          <w:sz w:val="32"/>
+          <w:szCs w:val="32"/>
+        </w:rPr>
+      </w:pPr>
+      <w:bookmarkStart w:id="0" w:name="_Toc230562502"/>
+      <w:r>
+        <w:rPr>
+          <w:sz w:val="32"/>
+          <w:szCs w:val="32"/>
+        </w:rPr>
+        <w:t>KUBERNETES-BASED PROGRESSIVE DELIVERY AND AUTOMATED ROLLBACK</w:t>
+      </w:r>
     </w:p>
     <w:p>
       <w:pPr>
@@ -30,11 +29,10 @@
         <w:ind w:right="413" w:firstLine="0"/>
         <w:jc w:val="center"/>
       </w:pPr>
-      <w:bookmarkStart w:id="1" w:name="_Toc230562502"/>
       <w:r>
         <w:t>A Synopsis Report</w:t>
       </w:r>
-      <w:bookmarkEnd w:id="1"/>
+      <w:bookmarkEnd w:id="0"/>
     </w:p>
     <w:p>
       <w:pPr>
@@ -331,7 +329,6 @@
           <w:szCs w:val="28"/>
         </w:rPr>
       </w:pPr>
-      <w:proofErr w:type="gramStart"/>
       <w:r>
         <w:rPr>
           <w:b/>
@@ -339,17 +336,7 @@
           <w:sz w:val="28"/>
           <w:szCs w:val="28"/>
         </w:rPr>
-        <w:t>Designation :</w:t>
-      </w:r>
-      <w:proofErr w:type="gramEnd"/>
-      <w:r>
-        <w:rPr>
-          <w:b/>
-          <w:bCs/>
-          <w:sz w:val="28"/>
-          <w:szCs w:val="28"/>
-        </w:rPr>
-        <w:t xml:space="preserve"> Assistant Professor</w:t>
+        <w:t>Designation : Assistant Professor</w:t>
       </w:r>
     </w:p>
     <w:p>
@@ -600,11 +587,11 @@
         <w:spacing w:before="347" w:line="276" w:lineRule="auto"/>
         <w:ind w:right="421"/>
       </w:pPr>
-      <w:bookmarkStart w:id="2" w:name="_Toc230562503"/>
+      <w:bookmarkStart w:id="1" w:name="_Toc230562503"/>
       <w:r>
         <w:t>TULA’S INSTITUTE, DEHRADUN</w:t>
       </w:r>
-      <w:bookmarkEnd w:id="2"/>
+      <w:bookmarkEnd w:id="1"/>
     </w:p>
     <w:p>
       <w:pPr>
@@ -751,12 +738,12 @@
         <w:spacing w:after="30" w:line="276" w:lineRule="auto"/>
         <w:ind w:left="275"/>
       </w:pPr>
-      <w:bookmarkStart w:id="3" w:name="_Toc230562504"/>
+      <w:bookmarkStart w:id="2" w:name="_Toc230562504"/>
       <w:r>
         <w:lastRenderedPageBreak/>
         <w:t>TABLE OF CONTENTS</w:t>
       </w:r>
-      <w:bookmarkEnd w:id="3"/>
+      <w:bookmarkEnd w:id="2"/>
     </w:p>
     <w:p>
       <w:pPr>
@@ -2082,12 +2069,12 @@
         <w:ind w:left="145" w:firstLine="0"/>
         <w:jc w:val="center"/>
       </w:pPr>
-      <w:bookmarkStart w:id="4" w:name="_Toc230562505"/>
+      <w:bookmarkStart w:id="3" w:name="_Toc230562505"/>
       <w:r>
         <w:lastRenderedPageBreak/>
         <w:t>ABSTRACT</w:t>
       </w:r>
-      <w:bookmarkEnd w:id="4"/>
+      <w:bookmarkEnd w:id="3"/>
     </w:p>
     <w:p>
       <w:pPr>
@@ -2822,25 +2809,7 @@
           <w:szCs w:val="24"/>
           <w:lang w:val="en-US"/>
         </w:rPr>
-        <w:t xml:space="preserve">Modern cloud-native application deployment has increasingly moved toward controlled release strategies that reduce the risk associated with introducing new application versions. Kubernetes provides a standard mechanism for updating applications through its Deployment resource and </w:t>
-      </w:r>
-      <w:proofErr w:type="spellStart"/>
-      <w:r>
-        <w:rPr>
-          <w:sz w:val="24"/>
-          <w:szCs w:val="24"/>
-          <w:lang w:val="en-US"/>
-        </w:rPr>
-        <w:t>RollingUpdate</w:t>
-      </w:r>
-      <w:proofErr w:type="spellEnd"/>
-      <w:r>
-        <w:rPr>
-          <w:sz w:val="24"/>
-          <w:szCs w:val="24"/>
-          <w:lang w:val="en-US"/>
-        </w:rPr>
-        <w:t xml:space="preserve"> strategy. This approach gradually replaces existing application instances with the new version, but it provides limited control over progressive traffic exposure and does not inherently connect rollout decisions with application-level performance metrics [1].</w:t>
+        <w:t>Modern cloud-native application deployment has increasingly moved toward controlled release strategies that reduce the risk associated with introducing new application versions. Kubernetes provides a standard mechanism for updating applications through its Deployment resource and RollingUpdate strategy. This approach gradually replaces existing application instances with the new version, but it provides limited control over progressive traffic exposure and does not inherently connect rollout decisions with application-level performance metrics [1].</w:t>
       </w:r>
     </w:p>
     <w:p>
@@ -2996,43 +2965,7 @@
           <w:szCs w:val="24"/>
           <w:lang w:val="en-US"/>
         </w:rPr>
-        <w:t xml:space="preserve">. Argo Rollouts provides </w:t>
-      </w:r>
-      <w:proofErr w:type="spellStart"/>
-      <w:r>
-        <w:rPr>
-          <w:sz w:val="24"/>
-          <w:szCs w:val="24"/>
-          <w:lang w:val="en-US"/>
-        </w:rPr>
-        <w:t>AnalysisTemplate</w:t>
-      </w:r>
-      <w:proofErr w:type="spellEnd"/>
-      <w:r>
-        <w:rPr>
-          <w:sz w:val="24"/>
-          <w:szCs w:val="24"/>
-          <w:lang w:val="en-US"/>
-        </w:rPr>
-        <w:t xml:space="preserve"> and </w:t>
-      </w:r>
-      <w:proofErr w:type="spellStart"/>
-      <w:r>
-        <w:rPr>
-          <w:sz w:val="24"/>
-          <w:szCs w:val="24"/>
-          <w:lang w:val="en-US"/>
-        </w:rPr>
-        <w:t>AnalysisRun</w:t>
-      </w:r>
-      <w:proofErr w:type="spellEnd"/>
-      <w:r>
-        <w:rPr>
-          <w:sz w:val="24"/>
-          <w:szCs w:val="24"/>
-          <w:lang w:val="en-US"/>
-        </w:rPr>
-        <w:t xml:space="preserve"> resources that can evaluate metrics obtained from external providers. Prometheus can be configured as a metric provider, allowing application measurements such as request success rate or other monitored indicators to be evaluated during a rollout. Depending on the configured conditions, a rollout can continue when the analysis succeeds or be aborted when the analysis fails [3], [4].</w:t>
+        <w:t>. Argo Rollouts provides AnalysisTemplate and AnalysisRun resources that can evaluate metrics obtained from external providers. Prometheus can be configured as a metric provider, allowing application measurements such as request success rate or other monitored indicators to be evaluated during a rollout. Depending on the configured conditions, a rollout can continue when the analysis succeeds or be aborted when the analysis fails [3], [4].</w:t>
       </w:r>
     </w:p>
     <w:p>
@@ -5175,30 +5108,6 @@
     </w:p>
     <w:p>
       <w:pPr>
-        <w:widowControl/>
-        <w:spacing w:before="100" w:beforeAutospacing="1" w:after="100" w:afterAutospacing="1"/>
-        <w:outlineLvl w:val="2"/>
-        <w:rPr>
-          <w:b/>
-          <w:bCs/>
-          <w:sz w:val="28"/>
-          <w:szCs w:val="28"/>
-          <w:lang w:val="en-US"/>
-        </w:rPr>
-      </w:pPr>
-      <w:r>
-        <w:rPr>
-          <w:b/>
-          <w:bCs/>
-          <w:sz w:val="28"/>
-          <w:szCs w:val="28"/>
-          <w:lang w:val="en-US"/>
-        </w:rPr>
-        <w:t>6.2 Containerization and Orchestration Technologies</w:t>
-      </w:r>
-    </w:p>
-    <w:p>
-      <w:pPr>
         <w:pStyle w:val="ListParagraph"/>
         <w:widowControl/>
         <w:numPr>
@@ -5220,15 +5129,39 @@
           <w:szCs w:val="24"/>
           <w:lang w:val="en-US"/>
         </w:rPr>
-        <w:t>Docker</w:t>
-      </w:r>
-      <w:r>
-        <w:rPr>
-          <w:sz w:val="24"/>
-          <w:szCs w:val="24"/>
-          <w:lang w:val="en-US"/>
-        </w:rPr>
-        <w:t xml:space="preserve"> – Used to package the application and its dependencies into container images.</w:t>
+        <w:t xml:space="preserve">Python </w:t>
+      </w:r>
+      <w:r>
+        <w:rPr>
+          <w:sz w:val="24"/>
+          <w:szCs w:val="24"/>
+          <w:lang w:val="en-US"/>
+        </w:rPr>
+        <w:t>– used to run FlashAPI server and use its extensive support of libraries.</w:t>
+      </w:r>
+    </w:p>
+    <w:p>
+      <w:pPr>
+        <w:widowControl/>
+        <w:spacing w:before="100" w:beforeAutospacing="1" w:after="100" w:afterAutospacing="1"/>
+        <w:outlineLvl w:val="2"/>
+        <w:rPr>
+          <w:b/>
+          <w:bCs/>
+          <w:sz w:val="28"/>
+          <w:szCs w:val="28"/>
+          <w:lang w:val="en-US"/>
+        </w:rPr>
+      </w:pPr>
+      <w:r>
+        <w:rPr>
+          <w:b/>
+          <w:bCs/>
+          <w:sz w:val="28"/>
+          <w:szCs w:val="28"/>
+          <w:lang w:val="en-US"/>
+        </w:rPr>
+        <w:t>6.2 Containerization and Orchestration Technologies</w:t>
       </w:r>
     </w:p>
     <w:p>
@@ -5254,39 +5187,15 @@
           <w:szCs w:val="24"/>
           <w:lang w:val="en-US"/>
         </w:rPr>
-        <w:t>Kubernetes</w:t>
-      </w:r>
-      <w:r>
-        <w:rPr>
-          <w:sz w:val="24"/>
-          <w:szCs w:val="24"/>
-          <w:lang w:val="en-US"/>
-        </w:rPr>
-        <w:t xml:space="preserve"> – Used to deploy, manage, and orchestrate the containerized application.</w:t>
-      </w:r>
-    </w:p>
-    <w:p>
-      <w:pPr>
-        <w:widowControl/>
-        <w:spacing w:before="100" w:beforeAutospacing="1" w:after="100" w:afterAutospacing="1"/>
-        <w:outlineLvl w:val="2"/>
-        <w:rPr>
-          <w:b/>
-          <w:bCs/>
-          <w:sz w:val="28"/>
-          <w:szCs w:val="28"/>
-          <w:lang w:val="en-US"/>
-        </w:rPr>
-      </w:pPr>
-      <w:r>
-        <w:rPr>
-          <w:b/>
-          <w:bCs/>
-          <w:sz w:val="28"/>
-          <w:szCs w:val="28"/>
-          <w:lang w:val="en-US"/>
-        </w:rPr>
-        <w:t>6.3 Progressive Delivery and Deployment Technologies</w:t>
+        <w:t>Docker</w:t>
+      </w:r>
+      <w:r>
+        <w:rPr>
+          <w:sz w:val="24"/>
+          <w:szCs w:val="24"/>
+          <w:lang w:val="en-US"/>
+        </w:rPr>
+        <w:t xml:space="preserve"> – Used to package the application and its dependencies into container images.</w:t>
       </w:r>
     </w:p>
     <w:p>
@@ -5312,15 +5221,15 @@
           <w:szCs w:val="24"/>
           <w:lang w:val="en-US"/>
         </w:rPr>
-        <w:t>Argo Rollouts</w:t>
-      </w:r>
-      <w:r>
-        <w:rPr>
-          <w:sz w:val="24"/>
-          <w:szCs w:val="24"/>
-          <w:lang w:val="en-US"/>
-        </w:rPr>
-        <w:t xml:space="preserve"> – Used to implement canary-based progressive delivery, control rollout progression, evaluate deployment conditions, and perform automated rollback when the configured conditions are not satisfied.</w:t>
+        <w:t>Kubernetes</w:t>
+      </w:r>
+      <w:r>
+        <w:rPr>
+          <w:sz w:val="24"/>
+          <w:szCs w:val="24"/>
+          <w:lang w:val="en-US"/>
+        </w:rPr>
+        <w:t xml:space="preserve"> – Used to deploy, manage, and orchestrate the containerized application.</w:t>
       </w:r>
     </w:p>
     <w:p>
@@ -5344,7 +5253,7 @@
           <w:szCs w:val="28"/>
           <w:lang w:val="en-US"/>
         </w:rPr>
-        <w:t>6.4 Monitoring and Observability Technologies</w:t>
+        <w:t>6.3 Progressive Delivery and Deployment Technologies</w:t>
       </w:r>
     </w:p>
     <w:p>
@@ -5370,15 +5279,39 @@
           <w:szCs w:val="24"/>
           <w:lang w:val="en-US"/>
         </w:rPr>
-        <w:t>Prometheus</w:t>
-      </w:r>
-      <w:r>
-        <w:rPr>
-          <w:sz w:val="24"/>
-          <w:szCs w:val="24"/>
-          <w:lang w:val="en-US"/>
-        </w:rPr>
-        <w:t xml:space="preserve"> – Used to collect and evaluate application and deployment-related metrics during the rollout.</w:t>
+        <w:t>Argo Rollouts</w:t>
+      </w:r>
+      <w:r>
+        <w:rPr>
+          <w:sz w:val="24"/>
+          <w:szCs w:val="24"/>
+          <w:lang w:val="en-US"/>
+        </w:rPr>
+        <w:t xml:space="preserve"> – Used to implement canary-based progressive delivery, control rollout progression, evaluate deployment conditions, and perform automated rollback when the configured conditions are not satisfied.</w:t>
+      </w:r>
+    </w:p>
+    <w:p>
+      <w:pPr>
+        <w:widowControl/>
+        <w:spacing w:before="100" w:beforeAutospacing="1" w:after="100" w:afterAutospacing="1"/>
+        <w:outlineLvl w:val="2"/>
+        <w:rPr>
+          <w:b/>
+          <w:bCs/>
+          <w:sz w:val="28"/>
+          <w:szCs w:val="28"/>
+          <w:lang w:val="en-US"/>
+        </w:rPr>
+      </w:pPr>
+      <w:r>
+        <w:rPr>
+          <w:b/>
+          <w:bCs/>
+          <w:sz w:val="28"/>
+          <w:szCs w:val="28"/>
+          <w:lang w:val="en-US"/>
+        </w:rPr>
+        <w:t>6.4 Monitoring and Observability Technologies</w:t>
       </w:r>
     </w:p>
     <w:p>
@@ -5404,39 +5337,15 @@
           <w:szCs w:val="24"/>
           <w:lang w:val="en-US"/>
         </w:rPr>
-        <w:t>Grafana</w:t>
-      </w:r>
-      <w:r>
-        <w:rPr>
-          <w:sz w:val="24"/>
-          <w:szCs w:val="24"/>
-          <w:lang w:val="en-US"/>
-        </w:rPr>
-        <w:t xml:space="preserve"> – Used to visualize monitoring metrics and provide dashboards for observing application and deployment behavior.</w:t>
-      </w:r>
-    </w:p>
-    <w:p>
-      <w:pPr>
-        <w:widowControl/>
-        <w:spacing w:before="100" w:beforeAutospacing="1" w:after="100" w:afterAutospacing="1"/>
-        <w:outlineLvl w:val="2"/>
-        <w:rPr>
-          <w:b/>
-          <w:bCs/>
-          <w:sz w:val="28"/>
-          <w:szCs w:val="28"/>
-          <w:lang w:val="en-US"/>
-        </w:rPr>
-      </w:pPr>
-      <w:r>
-        <w:rPr>
-          <w:b/>
-          <w:bCs/>
-          <w:sz w:val="28"/>
-          <w:szCs w:val="28"/>
-          <w:lang w:val="en-US"/>
-        </w:rPr>
-        <w:t>6.5 Configuration Technologies</w:t>
+        <w:t>Prometheus</w:t>
+      </w:r>
+      <w:r>
+        <w:rPr>
+          <w:sz w:val="24"/>
+          <w:szCs w:val="24"/>
+          <w:lang w:val="en-US"/>
+        </w:rPr>
+        <w:t xml:space="preserve"> – Used to collect and evaluate application and deployment-related metrics during the rollout.</w:t>
       </w:r>
     </w:p>
     <w:p>
@@ -5462,15 +5371,15 @@
           <w:szCs w:val="24"/>
           <w:lang w:val="en-US"/>
         </w:rPr>
-        <w:t>YAML</w:t>
-      </w:r>
-      <w:r>
-        <w:rPr>
-          <w:sz w:val="24"/>
-          <w:szCs w:val="24"/>
-          <w:lang w:val="en-US"/>
-        </w:rPr>
-        <w:t xml:space="preserve"> – Used for defining Kubernetes resources, Argo Rollouts configurations, deployment strategies, services, and analysis configurations.</w:t>
+        <w:t>Grafana</w:t>
+      </w:r>
+      <w:r>
+        <w:rPr>
+          <w:sz w:val="24"/>
+          <w:szCs w:val="24"/>
+          <w:lang w:val="en-US"/>
+        </w:rPr>
+        <w:t xml:space="preserve"> – Used to visualize monitoring metrics and provide dashboards for observing application and deployment behavior.</w:t>
       </w:r>
     </w:p>
     <w:p>
@@ -5494,7 +5403,7 @@
           <w:szCs w:val="28"/>
           <w:lang w:val="en-US"/>
         </w:rPr>
-        <w:t>6.6 Development and Version Control Tools</w:t>
+        <w:t>6.5 Configuration Technologies</w:t>
       </w:r>
     </w:p>
     <w:p>
@@ -5520,15 +5429,39 @@
           <w:szCs w:val="24"/>
           <w:lang w:val="en-US"/>
         </w:rPr>
-        <w:t>Visual Studio Code</w:t>
-      </w:r>
-      <w:r>
-        <w:rPr>
-          <w:sz w:val="24"/>
-          <w:szCs w:val="24"/>
-          <w:lang w:val="en-US"/>
-        </w:rPr>
-        <w:t xml:space="preserve"> – Used as the development and configuration environment.</w:t>
+        <w:t>YAML</w:t>
+      </w:r>
+      <w:r>
+        <w:rPr>
+          <w:sz w:val="24"/>
+          <w:szCs w:val="24"/>
+          <w:lang w:val="en-US"/>
+        </w:rPr>
+        <w:t xml:space="preserve"> – Used for defining Kubernetes resources, Argo Rollouts configurations, deployment strategies, services, and analysis configurations.</w:t>
+      </w:r>
+    </w:p>
+    <w:p>
+      <w:pPr>
+        <w:widowControl/>
+        <w:spacing w:before="100" w:beforeAutospacing="1" w:after="100" w:afterAutospacing="1"/>
+        <w:outlineLvl w:val="2"/>
+        <w:rPr>
+          <w:b/>
+          <w:bCs/>
+          <w:sz w:val="28"/>
+          <w:szCs w:val="28"/>
+          <w:lang w:val="en-US"/>
+        </w:rPr>
+      </w:pPr>
+      <w:r>
+        <w:rPr>
+          <w:b/>
+          <w:bCs/>
+          <w:sz w:val="28"/>
+          <w:szCs w:val="28"/>
+          <w:lang w:val="en-US"/>
+        </w:rPr>
+        <w:t>6.6 Development and Version Control Tools</w:t>
       </w:r>
     </w:p>
     <w:p>
@@ -5554,15 +5487,15 @@
           <w:szCs w:val="24"/>
           <w:lang w:val="en-US"/>
         </w:rPr>
-        <w:t>Git</w:t>
-      </w:r>
-      <w:r>
-        <w:rPr>
-          <w:sz w:val="24"/>
-          <w:szCs w:val="24"/>
-          <w:lang w:val="en-US"/>
-        </w:rPr>
-        <w:t xml:space="preserve"> – Used for source-code and configuration version control.</w:t>
+        <w:t>Visual Studio Code</w:t>
+      </w:r>
+      <w:r>
+        <w:rPr>
+          <w:sz w:val="24"/>
+          <w:szCs w:val="24"/>
+          <w:lang w:val="en-US"/>
+        </w:rPr>
+        <w:t xml:space="preserve"> – Used as the development and configuration environment.</w:t>
       </w:r>
     </w:p>
     <w:p>
@@ -5588,6 +5521,40 @@
           <w:szCs w:val="24"/>
           <w:lang w:val="en-US"/>
         </w:rPr>
+        <w:t>Git</w:t>
+      </w:r>
+      <w:r>
+        <w:rPr>
+          <w:sz w:val="24"/>
+          <w:szCs w:val="24"/>
+          <w:lang w:val="en-US"/>
+        </w:rPr>
+        <w:t xml:space="preserve"> – Used for source-code and configuration version control.</w:t>
+      </w:r>
+    </w:p>
+    <w:p>
+      <w:pPr>
+        <w:pStyle w:val="ListParagraph"/>
+        <w:widowControl/>
+        <w:numPr>
+          <w:ilvl w:val="0"/>
+          <w:numId w:val="36"/>
+        </w:numPr>
+        <w:spacing w:before="100" w:beforeAutospacing="1" w:after="100" w:afterAutospacing="1"/>
+        <w:rPr>
+          <w:sz w:val="24"/>
+          <w:szCs w:val="24"/>
+          <w:lang w:val="en-US"/>
+        </w:rPr>
+      </w:pPr>
+      <w:r>
+        <w:rPr>
+          <w:b/>
+          <w:bCs/>
+          <w:sz w:val="24"/>
+          <w:szCs w:val="24"/>
+          <w:lang w:val="en-US"/>
+        </w:rPr>
         <w:t>GitHub</w:t>
       </w:r>
       <w:r>
@@ -5743,25 +5710,7 @@
           <w:szCs w:val="24"/>
           <w:lang w:val="en-US"/>
         </w:rPr>
-        <w:t xml:space="preserve">The </w:t>
-      </w:r>
-      <w:proofErr w:type="spellStart"/>
-      <w:r>
-        <w:rPr>
-          <w:sz w:val="24"/>
-          <w:szCs w:val="24"/>
-          <w:lang w:val="en-US"/>
-        </w:rPr>
-        <w:t>Dockerized</w:t>
-      </w:r>
-      <w:proofErr w:type="spellEnd"/>
-      <w:r>
-        <w:rPr>
-          <w:sz w:val="24"/>
-          <w:szCs w:val="24"/>
-          <w:lang w:val="en-US"/>
-        </w:rPr>
-        <w:t xml:space="preserve"> application is deployed on a Kubernetes cluster. Kubernetes manages the application pods and provides the deployment environment required for running the stable and newly released application versions.</w:t>
+        <w:t>The Dockerized application is deployed on a Kubernetes cluster. Kubernetes manages the application pods and provides the deployment environment required for running the stable and newly released application versions.</w:t>
       </w:r>
     </w:p>
     <w:p>
@@ -6004,6 +5953,301 @@
     </w:p>
     <w:p>
       <w:pPr>
+        <w:rPr>
+          <w:sz w:val="24"/>
+          <w:szCs w:val="24"/>
+          <w:lang w:val="en-US"/>
+        </w:rPr>
+      </w:pPr>
+      <w:r>
+        <w:rPr>
+          <w:sz w:val="24"/>
+          <w:szCs w:val="24"/>
+          <w:lang w:val="en-US"/>
+        </w:rPr>
+        <w:br w:type="page"/>
+      </w:r>
+    </w:p>
+    <w:p>
+      <w:pPr>
+        <w:widowControl/>
+        <w:spacing w:before="100" w:beforeAutospacing="1" w:after="100" w:afterAutospacing="1"/>
+        <w:rPr>
+          <w:sz w:val="24"/>
+          <w:szCs w:val="24"/>
+          <w:lang w:val="en-US"/>
+        </w:rPr>
+      </w:pPr>
+      <w:r>
+        <w:rPr>
+          <w:noProof/>
+        </w:rPr>
+        <w:lastRenderedPageBreak/>
+        <mc:AlternateContent>
+          <mc:Choice Requires="wps">
+            <w:drawing>
+              <wp:inline distT="0" distB="0" distL="0" distR="0" wp14:anchorId="34B9D6D8" wp14:editId="5873F94E">
+                <wp:extent cx="304800" cy="304800"/>
+                <wp:effectExtent l="0" t="0" r="0" b="0"/>
+                <wp:docPr id="318793402" name="AutoShape 2" descr="Kubernetes Progressive Deployment Architecture"/>
+                <wp:cNvGraphicFramePr>
+                  <a:graphicFrameLocks xmlns:a="http://schemas.openxmlformats.org/drawingml/2006/main" noChangeAspect="1"/>
+                </wp:cNvGraphicFramePr>
+                <a:graphic xmlns:a="http://schemas.openxmlformats.org/drawingml/2006/main">
+                  <a:graphicData uri="http://schemas.microsoft.com/office/word/2010/wordprocessingShape">
+                    <wps:wsp>
+                      <wps:cNvSpPr>
+                        <a:spLocks noChangeAspect="1" noChangeArrowheads="1"/>
+                      </wps:cNvSpPr>
+                      <wps:spPr bwMode="auto">
+                        <a:xfrm>
+                          <a:off x="0" y="0"/>
+                          <a:ext cx="304800" cy="304800"/>
+                        </a:xfrm>
+                        <a:prstGeom prst="rect">
+                          <a:avLst/>
+                        </a:prstGeom>
+                        <a:noFill/>
+                        <a:ln>
+                          <a:noFill/>
+                        </a:ln>
+                        <a:extLst>
+                          <a:ext uri="{909E8E84-426E-40DD-AFC4-6F175D3DCCD1}">
+                            <a14:hiddenFill xmlns:a14="http://schemas.microsoft.com/office/drawing/2010/main">
+                              <a:solidFill>
+                                <a:srgbClr val="FFFFFF"/>
+                              </a:solidFill>
+                            </a14:hiddenFill>
+                          </a:ext>
+                          <a:ext uri="{91240B29-F687-4F45-9708-019B960494DF}">
+                            <a14:hiddenLine xmlns:a14="http://schemas.microsoft.com/office/drawing/2010/main" w="9525">
+                              <a:solidFill>
+                                <a:srgbClr val="000000"/>
+                              </a:solidFill>
+                              <a:miter lim="800000"/>
+                              <a:headEnd/>
+                              <a:tailEnd/>
+                            </a14:hiddenLine>
+                          </a:ext>
+                        </a:extLst>
+                      </wps:spPr>
+                      <wps:bodyPr rot="0" vert="horz" wrap="square" lIns="91440" tIns="45720" rIns="91440" bIns="45720" anchor="t" anchorCtr="0" upright="1">
+                        <a:noAutofit/>
+                      </wps:bodyPr>
+                    </wps:wsp>
+                  </a:graphicData>
+                </a:graphic>
+              </wp:inline>
+            </w:drawing>
+          </mc:Choice>
+          <mc:Fallback>
+            <w:pict>
+              <v:rect w14:anchorId="0E8335C2" id="AutoShape 2" o:spid="_x0000_s1026" alt="Kubernetes Progressive Deployment Architecture" style="width:24pt;height:24pt;visibility:visible;mso-wrap-style:square;mso-left-percent:-10001;mso-top-percent:-10001;mso-position-horizontal:absolute;mso-position-horizontal-relative:char;mso-position-vertical:absolute;mso-position-vertical-relative:line;mso-left-percent:-10001;mso-top-percent:-10001;v-text-anchor:top" o:gfxdata="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" filled="f" stroked="f">
+                <o:lock v:ext="edit" aspectratio="t"/>
+                <w10:anchorlock/>
+              </v:rect>
+            </w:pict>
+          </mc:Fallback>
+        </mc:AlternateContent>
+      </w:r>
+      <w:r>
+        <w:rPr>
+          <w:noProof/>
+        </w:rPr>
+        <mc:AlternateContent>
+          <mc:Choice Requires="wps">
+            <w:drawing>
+              <wp:inline distT="0" distB="0" distL="0" distR="0" wp14:anchorId="3F54FE6D" wp14:editId="6E887F4E">
+                <wp:extent cx="304800" cy="304800"/>
+                <wp:effectExtent l="0" t="0" r="0" b="0"/>
+                <wp:docPr id="801764434" name="Rectangle 3" descr="Kubernetes Progressive Deployment Architecture"/>
+                <wp:cNvGraphicFramePr>
+                  <a:graphicFrameLocks xmlns:a="http://schemas.openxmlformats.org/drawingml/2006/main" noChangeAspect="1"/>
+                </wp:cNvGraphicFramePr>
+                <a:graphic xmlns:a="http://schemas.openxmlformats.org/drawingml/2006/main">
+                  <a:graphicData uri="http://schemas.microsoft.com/office/word/2010/wordprocessingShape">
+                    <wps:wsp>
+                      <wps:cNvSpPr>
+                        <a:spLocks noChangeAspect="1" noChangeArrowheads="1"/>
+                      </wps:cNvSpPr>
+                      <wps:spPr bwMode="auto">
+                        <a:xfrm>
+                          <a:off x="0" y="0"/>
+                          <a:ext cx="304800" cy="304800"/>
+                        </a:xfrm>
+                        <a:prstGeom prst="rect">
+                          <a:avLst/>
+                        </a:prstGeom>
+                        <a:noFill/>
+                        <a:ln>
+                          <a:noFill/>
+                        </a:ln>
+                        <a:extLst>
+                          <a:ext uri="{909E8E84-426E-40DD-AFC4-6F175D3DCCD1}">
+                            <a14:hiddenFill xmlns:a14="http://schemas.microsoft.com/office/drawing/2010/main">
+                              <a:solidFill>
+                                <a:srgbClr val="FFFFFF"/>
+                              </a:solidFill>
+                            </a14:hiddenFill>
+                          </a:ext>
+                          <a:ext uri="{91240B29-F687-4F45-9708-019B960494DF}">
+                            <a14:hiddenLine xmlns:a14="http://schemas.microsoft.com/office/drawing/2010/main" w="9525">
+                              <a:solidFill>
+                                <a:srgbClr val="000000"/>
+                              </a:solidFill>
+                              <a:miter lim="800000"/>
+                              <a:headEnd/>
+                              <a:tailEnd/>
+                            </a14:hiddenLine>
+                          </a:ext>
+                        </a:extLst>
+                      </wps:spPr>
+                      <wps:bodyPr rot="0" vert="horz" wrap="square" lIns="91440" tIns="45720" rIns="91440" bIns="45720" anchor="t" anchorCtr="0" upright="1">
+                        <a:noAutofit/>
+                      </wps:bodyPr>
+                    </wps:wsp>
+                  </a:graphicData>
+                </a:graphic>
+              </wp:inline>
+            </w:drawing>
+          </mc:Choice>
+          <mc:Fallback>
+            <w:pict>
+              <v:rect w14:anchorId="7659A3B7" id="Rectangle 3" o:spid="_x0000_s1026" alt="Kubernetes Progressive Deployment Architecture" style="width:24pt;height:24pt;visibility:visible;mso-wrap-style:square;mso-left-percent:-10001;mso-top-percent:-10001;mso-position-horizontal:absolute;mso-position-horizontal-relative:char;mso-position-vertical:absolute;mso-position-vertical-relative:line;mso-left-percent:-10001;mso-top-percent:-10001;v-text-anchor:top" o:gfxdata="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" filled="f" stroked="f">
+                <o:lock v:ext="edit" aspectratio="t"/>
+                <w10:anchorlock/>
+              </v:rect>
+            </w:pict>
+          </mc:Fallback>
+        </mc:AlternateContent>
+      </w:r>
+    </w:p>
+    <w:p>
+      <w:pPr>
+        <w:widowControl/>
+        <w:spacing w:before="100" w:beforeAutospacing="1" w:after="100" w:afterAutospacing="1"/>
+        <w:rPr>
+          <w:sz w:val="24"/>
+          <w:szCs w:val="24"/>
+          <w:lang w:val="en-US"/>
+        </w:rPr>
+      </w:pPr>
+    </w:p>
+    <w:p>
+      <w:pPr>
+        <w:widowControl/>
+        <w:spacing w:before="100" w:beforeAutospacing="1" w:after="100" w:afterAutospacing="1"/>
+        <w:rPr>
+          <w:sz w:val="24"/>
+          <w:szCs w:val="24"/>
+          <w:lang w:val="en-US"/>
+        </w:rPr>
+      </w:pPr>
+    </w:p>
+    <w:p>
+      <w:pPr>
+        <w:widowControl/>
+        <w:spacing w:before="100" w:beforeAutospacing="1" w:after="100" w:afterAutospacing="1"/>
+        <w:rPr>
+          <w:sz w:val="24"/>
+          <w:szCs w:val="24"/>
+          <w:lang w:val="en-US"/>
+        </w:rPr>
+      </w:pPr>
+    </w:p>
+    <w:p>
+      <w:pPr>
+        <w:widowControl/>
+        <w:spacing w:before="100" w:beforeAutospacing="1" w:after="100" w:afterAutospacing="1"/>
+        <w:rPr>
+          <w:sz w:val="24"/>
+          <w:szCs w:val="24"/>
+          <w:lang w:val="en-US"/>
+        </w:rPr>
+      </w:pPr>
+      <w:r>
+        <w:rPr>
+          <w:noProof/>
+        </w:rPr>
+        <w:drawing>
+          <wp:anchor distT="0" distB="0" distL="114300" distR="114300" simplePos="0" relativeHeight="251660288" behindDoc="0" locked="0" layoutInCell="1" allowOverlap="1" wp14:anchorId="636B0720" wp14:editId="4DAEC8A6">
+            <wp:simplePos x="0" y="0"/>
+            <wp:positionH relativeFrom="margin">
+              <wp:align>center</wp:align>
+            </wp:positionH>
+            <wp:positionV relativeFrom="margin">
+              <wp:align>center</wp:align>
+            </wp:positionV>
+            <wp:extent cx="7330440" cy="5276850"/>
+            <wp:effectExtent l="0" t="0" r="3810" b="0"/>
+            <wp:wrapSquare wrapText="bothSides"/>
+            <wp:docPr id="1321008819" name="Picture 4"/>
+            <wp:cNvGraphicFramePr>
+              <a:graphicFrameLocks xmlns:a="http://schemas.openxmlformats.org/drawingml/2006/main" noChangeAspect="1"/>
+            </wp:cNvGraphicFramePr>
+            <a:graphic xmlns:a="http://schemas.openxmlformats.org/drawingml/2006/main">
+              <a:graphicData uri="http://schemas.openxmlformats.org/drawingml/2006/picture">
+                <pic:pic xmlns:pic="http://schemas.openxmlformats.org/drawingml/2006/picture">
+                  <pic:nvPicPr>
+                    <pic:cNvPr id="0" name="Picture 8"/>
+                    <pic:cNvPicPr>
+                      <a:picLocks noChangeAspect="1" noChangeArrowheads="1"/>
+                    </pic:cNvPicPr>
+                  </pic:nvPicPr>
+                  <pic:blipFill>
+                    <a:blip r:embed="rId15">
+                      <a:extLst>
+                        <a:ext uri="{28A0092B-C50C-407E-A947-70E740481C1C}">
+                          <a14:useLocalDpi xmlns:a14="http://schemas.microsoft.com/office/drawing/2010/main" val="0"/>
+                        </a:ext>
+                      </a:extLst>
+                    </a:blip>
+                    <a:srcRect/>
+                    <a:stretch>
+                      <a:fillRect/>
+                    </a:stretch>
+                  </pic:blipFill>
+                  <pic:spPr bwMode="auto">
+                    <a:xfrm>
+                      <a:off x="0" y="0"/>
+                      <a:ext cx="7330440" cy="5276850"/>
+                    </a:xfrm>
+                    <a:prstGeom prst="rect">
+                      <a:avLst/>
+                    </a:prstGeom>
+                    <a:noFill/>
+                    <a:ln>
+                      <a:noFill/>
+                    </a:ln>
+                  </pic:spPr>
+                </pic:pic>
+              </a:graphicData>
+            </a:graphic>
+            <wp14:sizeRelH relativeFrom="margin">
+              <wp14:pctWidth>0</wp14:pctWidth>
+            </wp14:sizeRelH>
+          </wp:anchor>
+        </w:drawing>
+      </w:r>
+    </w:p>
+    <w:p>
+      <w:pPr>
+        <w:widowControl/>
+        <w:tabs>
+          <w:tab w:val="left" w:pos="360"/>
+          <w:tab w:val="left" w:pos="990"/>
+        </w:tabs>
+        <w:spacing w:before="100" w:beforeAutospacing="1" w:after="100" w:afterAutospacing="1"/>
+        <w:ind w:right="-1400"/>
+        <w:rPr>
+          <w:sz w:val="24"/>
+          <w:szCs w:val="24"/>
+          <w:lang w:val="en-US"/>
+        </w:rPr>
+      </w:pPr>
+    </w:p>
+    <w:p>
+      <w:pPr>
         <w:jc w:val="center"/>
         <w:rPr>
           <w:b/>
@@ -6033,7 +6277,7 @@
         <w:pStyle w:val="pdq2pgselectionanchorcontainer"/>
         <w:jc w:val="center"/>
       </w:pPr>
-      <w:bookmarkStart w:id="5" w:name="_Toc230562508"/>
+      <w:bookmarkStart w:id="4" w:name="_Toc230562508"/>
       <w:r>
         <w:rPr>
           <w:b/>
@@ -6504,7 +6748,7 @@
         </w:rPr>
         <w:t xml:space="preserve">[1] Kubernetes, “Deployments,” Kubernetes Documentation. </w:t>
       </w:r>
-      <w:hyperlink r:id="rId15" w:tgtFrame="_blank" w:history="1">
+      <w:hyperlink r:id="rId16" w:tgtFrame="_blank" w:history="1">
         <w:r>
           <w:rPr>
             <w:color w:val="0000FF"/>
@@ -6555,7 +6799,7 @@
         </w:rPr>
         <w:t xml:space="preserve">[2] Kubernetes, “Update a Deployment Without Downtime,” Kubernetes Documentation. </w:t>
       </w:r>
-      <w:hyperlink r:id="rId16" w:tgtFrame="_blank" w:history="1">
+      <w:hyperlink r:id="rId17" w:tgtFrame="_blank" w:history="1">
         <w:r>
           <w:rPr>
             <w:color w:val="0000FF"/>
@@ -6586,7 +6830,7 @@
         </w:rPr>
         <w:t xml:space="preserve">[3] Argo Project, “Argo Rollouts – Concepts,” Argo Rollouts Documentation. </w:t>
       </w:r>
-      <w:hyperlink r:id="rId17" w:tgtFrame="_blank" w:history="1">
+      <w:hyperlink r:id="rId18" w:tgtFrame="_blank" w:history="1">
         <w:r>
           <w:rPr>
             <w:color w:val="0000FF"/>
@@ -6617,7 +6861,7 @@
         </w:rPr>
         <w:t xml:space="preserve">[4] Argo Project, “Canary Deployment Strategy,” Argo Rollouts Documentation. </w:t>
       </w:r>
-      <w:hyperlink r:id="rId18" w:tgtFrame="_blank" w:history="1">
+      <w:hyperlink r:id="rId19" w:tgtFrame="_blank" w:history="1">
         <w:r>
           <w:rPr>
             <w:color w:val="0000FF"/>
@@ -6648,7 +6892,7 @@
         </w:rPr>
         <w:t xml:space="preserve">[5] Argo Project, “Analysis &amp; Progressive Delivery,” Argo Rollouts Documentation. </w:t>
       </w:r>
-      <w:hyperlink r:id="rId19" w:tgtFrame="_blank" w:history="1">
+      <w:hyperlink r:id="rId20" w:tgtFrame="_blank" w:history="1">
         <w:r>
           <w:rPr>
             <w:color w:val="0000FF"/>
@@ -6679,7 +6923,7 @@
         </w:rPr>
         <w:t xml:space="preserve">[6] Argo Project, “Getting Started,” Argo Rollouts Documentation. </w:t>
       </w:r>
-      <w:hyperlink r:id="rId20" w:tgtFrame="_blank" w:history="1">
+      <w:hyperlink r:id="rId21" w:tgtFrame="_blank" w:history="1">
         <w:r>
           <w:rPr>
             <w:color w:val="0000FF"/>
@@ -6710,7 +6954,7 @@
         </w:rPr>
         <w:t xml:space="preserve">[7] Prometheus Authors, “Overview,” Prometheus Documentation. </w:t>
       </w:r>
-      <w:hyperlink r:id="rId21" w:tgtFrame="_blank" w:history="1">
+      <w:hyperlink r:id="rId22" w:tgtFrame="_blank" w:history="1">
         <w:r>
           <w:rPr>
             <w:color w:val="0000FF"/>
@@ -6741,7 +6985,7 @@
         </w:rPr>
         <w:t xml:space="preserve">[8] Prometheus Authors, “First Steps with Prometheus,” Prometheus Documentation. </w:t>
       </w:r>
-      <w:hyperlink r:id="rId22" w:tgtFrame="_blank" w:history="1">
+      <w:hyperlink r:id="rId23" w:tgtFrame="_blank" w:history="1">
         <w:r>
           <w:rPr>
             <w:color w:val="0000FF"/>
@@ -6772,7 +7016,7 @@
         </w:rPr>
         <w:t xml:space="preserve">[9] Grafana Labs, “Prometheus Data Source,” Grafana Documentation. </w:t>
       </w:r>
-      <w:hyperlink r:id="rId23" w:tgtFrame="_blank" w:history="1">
+      <w:hyperlink r:id="rId24" w:tgtFrame="_blank" w:history="1">
         <w:r>
           <w:rPr>
             <w:color w:val="0000FF"/>
@@ -6801,27 +7045,9 @@
           <w:szCs w:val="24"/>
           <w:lang w:val="en-US"/>
         </w:rPr>
-        <w:t xml:space="preserve">[10] Docker Inc., “What is </w:t>
-      </w:r>
-      <w:proofErr w:type="gramStart"/>
-      <w:r>
-        <w:rPr>
-          <w:sz w:val="24"/>
-          <w:szCs w:val="24"/>
-          <w:lang w:val="en-US"/>
-        </w:rPr>
-        <w:t>Docker?,</w:t>
-      </w:r>
-      <w:proofErr w:type="gramEnd"/>
-      <w:r>
-        <w:rPr>
-          <w:sz w:val="24"/>
-          <w:szCs w:val="24"/>
-          <w:lang w:val="en-US"/>
-        </w:rPr>
-        <w:t xml:space="preserve">” Docker Documentation. </w:t>
-      </w:r>
-      <w:hyperlink r:id="rId24" w:tgtFrame="_blank" w:history="1">
+        <w:t xml:space="preserve">[10] Docker Inc., “What is Docker?,” Docker Documentation. </w:t>
+      </w:r>
+      <w:hyperlink r:id="rId25" w:tgtFrame="_blank" w:history="1">
         <w:r>
           <w:rPr>
             <w:color w:val="0000FF"/>
@@ -6857,6 +7083,7 @@
         </w:rPr>
       </w:pPr>
     </w:p>
+    <w:bookmarkEnd w:id="4"/>
     <w:p>
       <w:pPr>
         <w:rPr>
@@ -6866,295 +7093,9 @@
           <w:szCs w:val="28"/>
         </w:rPr>
       </w:pPr>
-      <w:r>
-        <w:br w:type="page"/>
-      </w:r>
-    </w:p>
-    <w:bookmarkEnd w:id="5"/>
-    <w:p>
-      <w:pPr>
-        <w:spacing w:after="30" w:line="276" w:lineRule="auto"/>
-        <w:rPr>
-          <w:b/>
-          <w:bCs/>
-          <w:noProof/>
-          <w:sz w:val="24"/>
-          <w:szCs w:val="24"/>
-        </w:rPr>
-      </w:pPr>
-    </w:p>
-    <w:p>
-      <w:pPr>
-        <w:spacing w:after="30" w:line="276" w:lineRule="auto"/>
-        <w:rPr>
-          <w:b/>
-          <w:bCs/>
-          <w:noProof/>
-          <w:sz w:val="24"/>
-          <w:szCs w:val="24"/>
-          <w:lang w:val="en-US"/>
-        </w:rPr>
-      </w:pPr>
-      <w:r>
-        <w:rPr>
-          <w:b/>
-          <w:bCs/>
-          <w:noProof/>
-          <w:sz w:val="24"/>
-          <w:szCs w:val="24"/>
-        </w:rPr>
-        <w:t>System Architecture Diagram</w:t>
-      </w:r>
-      <w:r>
-        <w:rPr>
-          <w:b/>
-          <w:bCs/>
-          <w:noProof/>
-          <w:sz w:val="24"/>
-          <w:szCs w:val="24"/>
-        </w:rPr>
-        <w:t>:</w:t>
-      </w:r>
-    </w:p>
-    <w:p>
-      <w:pPr>
-        <w:spacing w:after="30" w:line="276" w:lineRule="auto"/>
-        <w:rPr>
-          <w:noProof/>
-          <w:lang w:val="en-US"/>
-        </w:rPr>
-      </w:pPr>
-      <w:r>
-        <w:rPr>
-          <w:noProof/>
-          <w:lang w:val="en-US"/>
-        </w:rPr>
-        <w:drawing>
-          <wp:inline distT="0" distB="0" distL="0" distR="0" wp14:anchorId="7101836F" wp14:editId="24853340">
-            <wp:extent cx="5503333" cy="3926601"/>
-            <wp:effectExtent l="0" t="0" r="2540" b="0"/>
-            <wp:docPr id="610714416" name="Picture 21"/>
-            <wp:cNvGraphicFramePr>
-              <a:graphicFrameLocks xmlns:a="http://schemas.openxmlformats.org/drawingml/2006/main" noChangeAspect="1"/>
-            </wp:cNvGraphicFramePr>
-            <a:graphic xmlns:a="http://schemas.openxmlformats.org/drawingml/2006/main">
-              <a:graphicData uri="http://schemas.openxmlformats.org/drawingml/2006/picture">
-                <pic:pic xmlns:pic="http://schemas.openxmlformats.org/drawingml/2006/picture">
-                  <pic:nvPicPr>
-                    <pic:cNvPr id="0" name="Picture 207"/>
-                    <pic:cNvPicPr>
-                      <a:picLocks noChangeAspect="1" noChangeArrowheads="1"/>
-                    </pic:cNvPicPr>
-                  </pic:nvPicPr>
-                  <pic:blipFill rotWithShape="1">
-                    <a:blip r:embed="rId25">
-                      <a:extLst>
-                        <a:ext uri="{28A0092B-C50C-407E-A947-70E740481C1C}">
-                          <a14:useLocalDpi xmlns:a14="http://schemas.microsoft.com/office/drawing/2010/main" val="0"/>
-                        </a:ext>
-                      </a:extLst>
-                    </a:blip>
-                    <a:srcRect b="8611"/>
-                    <a:stretch>
-                      <a:fillRect/>
-                    </a:stretch>
-                  </pic:blipFill>
-                  <pic:spPr bwMode="auto">
-                    <a:xfrm>
-                      <a:off x="0" y="0"/>
-                      <a:ext cx="5509196" cy="3930784"/>
-                    </a:xfrm>
-                    <a:prstGeom prst="rect">
-                      <a:avLst/>
-                    </a:prstGeom>
-                    <a:noFill/>
-                    <a:ln>
-                      <a:noFill/>
-                    </a:ln>
-                    <a:extLst>
-                      <a:ext uri="{53640926-AAD7-44D8-BBD7-CCE9431645EC}">
-                        <a14:shadowObscured xmlns:a14="http://schemas.microsoft.com/office/drawing/2010/main"/>
-                      </a:ext>
-                    </a:extLst>
-                  </pic:spPr>
-                </pic:pic>
-              </a:graphicData>
-            </a:graphic>
-          </wp:inline>
-        </w:drawing>
-      </w:r>
-    </w:p>
-    <w:p>
-      <w:pPr>
-        <w:spacing w:after="30" w:line="276" w:lineRule="auto"/>
-        <w:rPr>
-          <w:noProof/>
-          <w:lang w:val="en-US"/>
-        </w:rPr>
-      </w:pPr>
-    </w:p>
-    <w:p>
-      <w:pPr>
-        <w:spacing w:after="30" w:line="276" w:lineRule="auto"/>
-        <w:rPr>
-          <w:noProof/>
-          <w:lang w:val="en-US"/>
-        </w:rPr>
-      </w:pPr>
-    </w:p>
-    <w:p>
-      <w:pPr>
-        <w:spacing w:after="30" w:line="276" w:lineRule="auto"/>
-        <w:rPr>
-          <w:noProof/>
-          <w:lang w:val="en-US"/>
-        </w:rPr>
-      </w:pPr>
-    </w:p>
-    <w:p>
-      <w:pPr>
-        <w:spacing w:after="30" w:line="276" w:lineRule="auto"/>
-        <w:rPr>
-          <w:b/>
-          <w:bCs/>
-          <w:noProof/>
-          <w:sz w:val="24"/>
-          <w:szCs w:val="24"/>
-          <w:lang w:val="en-US"/>
-        </w:rPr>
-      </w:pPr>
-      <w:r>
-        <w:rPr>
-          <w:b/>
-          <w:bCs/>
-          <w:noProof/>
-          <w:sz w:val="24"/>
-          <w:szCs w:val="24"/>
-          <w:lang w:val="en-US"/>
-        </w:rPr>
-        <w:t>Algorithmic Program Flowchart</w:t>
-      </w:r>
-      <w:r>
-        <w:rPr>
-          <w:b/>
-          <w:bCs/>
-          <w:noProof/>
-          <w:sz w:val="24"/>
-          <w:szCs w:val="24"/>
-          <w:lang w:val="en-US"/>
-        </w:rPr>
-        <w:t>:</w:t>
-      </w:r>
-    </w:p>
-    <w:p>
-      <w:pPr>
-        <w:spacing w:after="30" w:line="276" w:lineRule="auto"/>
-        <w:rPr>
-          <w:noProof/>
-          <w:lang w:val="en-US"/>
-        </w:rPr>
-      </w:pPr>
-      <w:r>
-        <w:rPr>
-          <w:noProof/>
-          <w:lang w:val="en-US"/>
-        </w:rPr>
-        <w:lastRenderedPageBreak/>
-        <w:drawing>
-          <wp:inline distT="0" distB="0" distL="0" distR="0" wp14:anchorId="52F70721" wp14:editId="042127B3">
-            <wp:extent cx="5071533" cy="4113571"/>
-            <wp:effectExtent l="0" t="0" r="0" b="1270"/>
-            <wp:docPr id="845828233" name="Picture 19"/>
-            <wp:cNvGraphicFramePr>
-              <a:graphicFrameLocks xmlns:a="http://schemas.openxmlformats.org/drawingml/2006/main" noChangeAspect="1"/>
-            </wp:cNvGraphicFramePr>
-            <a:graphic xmlns:a="http://schemas.openxmlformats.org/drawingml/2006/main">
-              <a:graphicData uri="http://schemas.openxmlformats.org/drawingml/2006/picture">
-                <pic:pic xmlns:pic="http://schemas.openxmlformats.org/drawingml/2006/picture">
-                  <pic:nvPicPr>
-                    <pic:cNvPr id="0" name="Picture 200"/>
-                    <pic:cNvPicPr>
-                      <a:picLocks noChangeAspect="1" noChangeArrowheads="1"/>
-                    </pic:cNvPicPr>
-                  </pic:nvPicPr>
-                  <pic:blipFill rotWithShape="1">
-                    <a:blip r:embed="rId26">
-                      <a:extLst>
-                        <a:ext uri="{28A0092B-C50C-407E-A947-70E740481C1C}">
-                          <a14:useLocalDpi xmlns:a14="http://schemas.microsoft.com/office/drawing/2010/main" val="0"/>
-                        </a:ext>
-                      </a:extLst>
-                    </a:blip>
-                    <a:srcRect b="8586"/>
-                    <a:stretch>
-                      <a:fillRect/>
-                    </a:stretch>
-                  </pic:blipFill>
-                  <pic:spPr bwMode="auto">
-                    <a:xfrm>
-                      <a:off x="0" y="0"/>
-                      <a:ext cx="5079503" cy="4120035"/>
-                    </a:xfrm>
-                    <a:prstGeom prst="rect">
-                      <a:avLst/>
-                    </a:prstGeom>
-                    <a:noFill/>
-                    <a:ln>
-                      <a:noFill/>
-                    </a:ln>
-                    <a:extLst>
-                      <a:ext uri="{53640926-AAD7-44D8-BBD7-CCE9431645EC}">
-                        <a14:shadowObscured xmlns:a14="http://schemas.microsoft.com/office/drawing/2010/main"/>
-                      </a:ext>
-                    </a:extLst>
-                  </pic:spPr>
-                </pic:pic>
-              </a:graphicData>
-            </a:graphic>
-          </wp:inline>
-        </w:drawing>
-      </w:r>
-    </w:p>
-    <w:p>
-      <w:pPr>
-        <w:widowControl/>
-        <w:pBdr>
-          <w:top w:val="nil"/>
-          <w:left w:val="nil"/>
-          <w:bottom w:val="nil"/>
-          <w:right w:val="nil"/>
-          <w:between w:val="nil"/>
-        </w:pBdr>
-        <w:spacing w:after="30" w:line="276" w:lineRule="auto"/>
-        <w:jc w:val="both"/>
-        <w:rPr>
-          <w:color w:val="000000"/>
-          <w:sz w:val="24"/>
-          <w:szCs w:val="24"/>
-        </w:rPr>
-      </w:pPr>
-    </w:p>
-    <w:p>
-      <w:pPr>
-        <w:pBdr>
-          <w:top w:val="nil"/>
-          <w:left w:val="nil"/>
-          <w:bottom w:val="nil"/>
-          <w:right w:val="nil"/>
-          <w:between w:val="nil"/>
-        </w:pBdr>
-        <w:spacing w:after="30" w:line="276" w:lineRule="auto"/>
-        <w:ind w:left="141" w:right="280"/>
-        <w:jc w:val="both"/>
-        <w:rPr>
-          <w:color w:val="000000"/>
-          <w:sz w:val="24"/>
-          <w:szCs w:val="24"/>
-        </w:rPr>
-      </w:pPr>
     </w:p>
     <w:sectPr>
-      <w:footerReference w:type="default" r:id="rId27"/>
+      <w:footerReference w:type="default" r:id="rId26"/>
       <w:pgSz w:w="11920" w:h="16850"/>
       <w:pgMar w:top="1440" w:right="1440" w:bottom="1440" w:left="1440" w:header="0" w:footer="1022" w:gutter="0"/>
       <w:cols w:space="720"/>

</xml_diff>